<commit_message>
Enrich dataset with multi-word search phrases; refresh screenshots + report
- make_dataset.py now generates realistic multi-word queries (head x continuation)
  alongside the wordfreq single-word vocabulary (153,429 rows total)
- phrase counts derived from head popularity so head ranks above its phrases
- typeahead now suggests phrases like 'iphone pro', 'best laptop', 'macbook air price'
</commit_message>
<xml_diff>
--- a/docs/REPORT.docx
+++ b/docs/REPORT.docx
@@ -503,12 +503,6 @@
               <w:pStyle w:val="Compact"/>
             </w:pPr>
             <w:r>
-              <w:t xml:space="preserve">Python</w:t>
-            </w:r>
-            <w:r>
-              <w:t xml:space="preserve"> </w:t>
-            </w:r>
-            <w:r>
               <w:rPr>
                 <w:rStyle w:val="VerbatimChar"/>
               </w:rPr>
@@ -518,18 +512,18 @@
               <w:t xml:space="preserve"> </w:t>
             </w:r>
             <w:r>
-              <w:t xml:space="preserve">(149,998 rows)</w:t>
-            </w:r>
-          </w:p>
-        </w:tc>
-        <w:tc>
-          <w:tcPr/>
-          <w:p>
-            <w:pPr>
-              <w:pStyle w:val="Compact"/>
-            </w:pPr>
-            <w:r>
-              <w:t xml:space="preserve">Real frequency signal, &gt; 100k minimum</w:t>
+              <w:t xml:space="preserve">single words + generated multi-word search phrases (153,429 rows)</w:t>
+            </w:r>
+          </w:p>
+        </w:tc>
+        <w:tc>
+          <w:tcPr/>
+          <w:p>
+            <w:pPr>
+              <w:pStyle w:val="Compact"/>
+            </w:pPr>
+            <w:r>
+              <w:t xml:space="preserve">Real frequency signal + phrase autocomplete, &gt; 100k</w:t>
             </w:r>
           </w:p>
         </w:tc>
@@ -1271,6 +1265,116 @@
       </w:pPr>
       <w:r>
         <w:t xml:space="preserve">5. Data model</w:t>
+      </w:r>
+    </w:p>
+    <w:p>
+      <w:pPr>
+        <w:pStyle w:val="FirstParagraph"/>
+      </w:pPr>
+      <w:r>
+        <w:t xml:space="preserve">The dataset (</w:t>
+      </w:r>
+      <w:r>
+        <w:rPr>
+          <w:rStyle w:val="VerbatimChar"/>
+        </w:rPr>
+        <w:t xml:space="preserve">scripts/make_dataset.py</w:t>
+      </w:r>
+      <w:r>
+        <w:t xml:space="preserve">) has two parts: ~150k single-word terms</w:t>
+      </w:r>
+      <w:r>
+        <w:t xml:space="preserve"> </w:t>
+      </w:r>
+      <w:r>
+        <w:t xml:space="preserve">from</w:t>
+      </w:r>
+      <w:r>
+        <w:t xml:space="preserve"> </w:t>
+      </w:r>
+      <w:r>
+        <w:rPr>
+          <w:rStyle w:val="VerbatimChar"/>
+        </w:rPr>
+        <w:t xml:space="preserve">wordfreq</w:t>
+      </w:r>
+      <w:r>
+        <w:t xml:space="preserve"> </w:t>
+      </w:r>
+      <w:r>
+        <w:t xml:space="preserve">(frequency = popularity signal), plus ~3.4k generated multi-word</w:t>
+      </w:r>
+      <w:r>
+        <w:t xml:space="preserve"> </w:t>
+      </w:r>
+      <w:r>
+        <w:t xml:space="preserve">search phrases (popular</w:t>
+      </w:r>
+      <w:r>
+        <w:t xml:space="preserve"> </w:t>
+      </w:r>
+      <w:r>
+        <w:t xml:space="preserve">“head”</w:t>
+      </w:r>
+      <w:r>
+        <w:t xml:space="preserve"> </w:t>
+      </w:r>
+      <w:r>
+        <w:t xml:space="preserve">terms × common autocomplete continuations, e.g.</w:t>
+      </w:r>
+      <w:r>
+        <w:t xml:space="preserve"> </w:t>
+      </w:r>
+      <w:r>
+        <w:rPr>
+          <w:rStyle w:val="VerbatimChar"/>
+        </w:rPr>
+        <w:t xml:space="preserve">iphone pro max</w:t>
+      </w:r>
+      <w:r>
+        <w:t xml:space="preserve">,</w:t>
+      </w:r>
+      <w:r>
+        <w:t xml:space="preserve"> </w:t>
+      </w:r>
+      <w:r>
+        <w:rPr>
+          <w:rStyle w:val="VerbatimChar"/>
+        </w:rPr>
+        <w:t xml:space="preserve">best laptop</w:t>
+      </w:r>
+      <w:r>
+        <w:t xml:space="preserve">,</w:t>
+      </w:r>
+      <w:r>
+        <w:t xml:space="preserve"> </w:t>
+      </w:r>
+      <w:r>
+        <w:rPr>
+          <w:rStyle w:val="VerbatimChar"/>
+        </w:rPr>
+        <w:t xml:space="preserve">macbook air price</w:t>
+      </w:r>
+      <w:r>
+        <w:t xml:space="preserve">). Phrase counts are derived</w:t>
+      </w:r>
+      <w:r>
+        <w:t xml:space="preserve"> </w:t>
+      </w:r>
+      <w:r>
+        <w:t xml:space="preserve">from the head’s popularity and scaled down for specificity, so a phrase always</w:t>
+      </w:r>
+      <w:r>
+        <w:t xml:space="preserve"> </w:t>
+      </w:r>
+      <w:r>
+        <w:t xml:space="preserve">ranks below its head — the natural autocomplete order. The trie keys on the full</w:t>
+      </w:r>
+      <w:r>
+        <w:t xml:space="preserve"> </w:t>
+      </w:r>
+      <w:r>
+        <w:t xml:space="preserve">string, so single words and phrases share one index.</w:t>
       </w:r>
     </w:p>
     <w:p>
@@ -3177,7 +3281,7 @@
       <w:r>
         <w:drawing>
           <wp:inline>
-            <wp:extent cx="5334000" cy="3937215"/>
+            <wp:extent cx="5334000" cy="3706677"/>
             <wp:effectExtent b="0" l="0" r="0" t="0"/>
             <wp:docPr descr="Backend metrics" title="" id="27" name="Picture"/>
             <a:graphic>
@@ -3198,7 +3302,7 @@
                   <pic:spPr bwMode="auto">
                     <a:xfrm>
                       <a:off x="0" y="0"/>
-                      <a:ext cx="5334000" cy="3937215"/>
+                      <a:ext cx="5334000" cy="3706677"/>
                     </a:xfrm>
                     <a:prstGeom prst="rect">
                       <a:avLst/>

</xml_diff>